<commit_message>
Quiz puxando questoes do banco - Inserção
</commit_message>
<xml_diff>
--- a/Documentação/ConecRapOficial.docx
+++ b/Documentação/ConecRapOficial.docx
@@ -3,20 +3,71 @@
 <w:document xmlns:wpc="http://schemas.microsoft.com/office/word/2010/wordprocessingCanvas" xmlns:cx="http://schemas.microsoft.com/office/drawing/2014/chartex" xmlns:cx1="http://schemas.microsoft.com/office/drawing/2015/9/8/chartex" xmlns:cx2="http://schemas.microsoft.com/office/drawing/2015/10/21/chartex" xmlns:cx3="http://schemas.microsoft.com/office/drawing/2016/5/9/chartex" xmlns:cx4="http://schemas.microsoft.com/office/drawing/2016/5/10/chartex" xmlns:cx5="http://schemas.microsoft.com/office/drawing/2016/5/11/chartex" xmlns:cx6="http://schemas.microsoft.com/office/drawing/2016/5/12/chartex" xmlns:cx7="http://schemas.microsoft.com/office/drawing/2016/5/13/chartex" xmlns:cx8="http://schemas.microsoft.com/office/drawing/2016/5/14/chartex" xmlns:mc="http://schemas.openxmlformats.org/markup-compatibility/2006" xmlns:aink="http://schemas.microsoft.com/office/drawing/2016/ink" xmlns:am3d="http://schemas.microsoft.com/office/drawing/2017/model3d" xmlns:o="urn:schemas-microsoft-com:office:office" xmlns:oel="http://schemas.microsoft.com/office/2019/extlst" xmlns:r="http://schemas.openxmlformats.org/officeDocument/2006/relationships" xmlns:m="http://schemas.openxmlformats.org/officeDocument/2006/math" xmlns:v="urn:schemas-microsoft-com:vml" xmlns:wp14="http://schemas.microsoft.com/office/word/2010/wordprocessingDrawing" xmlns:wp="http://schemas.openxmlformats.org/drawingml/2006/wordprocessingDrawing" xmlns:w10="urn:schemas-microsoft-com:office:word" xmlns:w="http://schemas.openxmlformats.org/wordprocessingml/2006/main" xmlns:w14="http://schemas.microsoft.com/office/word/2010/wordml" xmlns:w15="http://schemas.microsoft.com/office/word/2012/wordml" xmlns:w16cex="http://schemas.microsoft.com/office/word/2018/wordml/cex" xmlns:w16cid="http://schemas.microsoft.com/office/word/2016/wordml/cid" xmlns:w16="http://schemas.microsoft.com/office/word/2018/wordml" xmlns:w16du="http://schemas.microsoft.com/office/word/2023/wordml/word16du" xmlns:w16sdtdh="http://schemas.microsoft.com/office/word/2020/wordml/sdtdatahash" xmlns:w16sdtfl="http://schemas.microsoft.com/office/word/2024/wordml/sdtformatlock" xmlns:w16se="http://schemas.microsoft.com/office/word/2015/wordml/symex" xmlns:wpg="http://schemas.microsoft.com/office/word/2010/wordprocessingGroup" xmlns:wpi="http://schemas.microsoft.com/office/word/2010/wordprocessingInk" xmlns:wne="http://schemas.microsoft.com/office/word/2006/wordml" xmlns:wps="http://schemas.microsoft.com/office/word/2010/wordprocessingShape" mc:Ignorable="w14 w15 w16se w16cid w16 w16cex w16sdtdh w16sdtfl w16du wp14">
   <w:body>
     <w:p>
-      <w:r>
-        <w:rPr>
-          <w:b/>
-          <w:bCs/>
-        </w:rPr>
-        <w:t>1</w:t>
-      </w:r>
-      <w:r>
-        <w:rPr>
-          <w:b/>
-          <w:bCs/>
-        </w:rPr>
-        <w:t>. Introdução</w:t>
-      </w:r>
+      <w:pPr>
+        <w:rPr>
+          <w:b/>
+          <w:bCs/>
+        </w:rPr>
+      </w:pPr>
+      <w:proofErr w:type="spellStart"/>
+      <w:r>
+        <w:rPr>
+          <w:b/>
+          <w:bCs/>
+        </w:rPr>
+        <w:t>ConecRap</w:t>
+      </w:r>
+      <w:proofErr w:type="spellEnd"/>
+      <w:r>
+        <w:rPr>
+          <w:b/>
+          <w:bCs/>
+        </w:rPr>
+        <w:t xml:space="preserve"> – O universo do Hip-Hop em um só lugar</w:t>
+      </w:r>
+    </w:p>
+    <w:p>
+      <w:r>
+        <w:rPr>
+          <w:b/>
+          <w:bCs/>
+        </w:rPr>
+        <w:t>01251057 – Hygor Silva Wanderlei</w:t>
+      </w:r>
+      <w:r>
+        <w:br/>
+      </w:r>
+      <w:r>
+        <w:rPr>
+          <w:b/>
+          <w:bCs/>
+        </w:rPr>
+        <w:t>2025 / SP</w:t>
+      </w:r>
+    </w:p>
+    <w:p>
+      <w:r>
+        <w:pict w14:anchorId="12E578E7">
+          <v:rect id="_x0000_i1025" style="width:0;height:1.5pt" o:hralign="center" o:hrstd="t" o:hr="t" fillcolor="#a0a0a0" stroked="f"/>
+        </w:pict>
+      </w:r>
+    </w:p>
+    <w:p>
+      <w:pPr>
+        <w:rPr>
+          <w:b/>
+          <w:bCs/>
+        </w:rPr>
+      </w:pPr>
+      <w:r>
+        <w:rPr>
+          <w:b/>
+          <w:bCs/>
+        </w:rPr>
+        <w:t>1. Introdução</w:t>
+      </w:r>
+    </w:p>
+    <w:p>
       <w:r>
         <w:br/>
         <w:t xml:space="preserve">Este projeto visa criar uma plataforma web para divulgar e conectar fãs da cultura Hip-Hop. O </w:t>
@@ -217,6 +268,7 @@
     </w:p>
     <w:p>
       <w:r>
+        <w:lastRenderedPageBreak/>
         <w:t xml:space="preserve">O nascimento do Hip-Hop está diretamente ligado à festa organizada por DJ </w:t>
       </w:r>
       <w:proofErr w:type="spellStart"/>
@@ -249,16 +301,20 @@
       </w:r>
       <w:proofErr w:type="spellEnd"/>
       <w:r>
-        <w:t xml:space="preserve"> utilizou dois toca-discos para repetir os “breaks” das músicas — partes instrumentais com batidas fortes que faziam a galera dançar com mais energia. Essa técnica foi um dos marcos iniciais do que mais tarde se tornaria a batida clássica do Hip-Hop.</w:t>
-      </w:r>
-    </w:p>
-    <w:p>
-      <w:r>
-        <w:t xml:space="preserve">A partir daí, MCs começaram a rimar sobre essas batidas, os jovens passaram a dançar nas ruas com passos únicos e o grafite se espalhou como arte visual das </w:t>
-      </w:r>
-      <w:r>
-        <w:lastRenderedPageBreak/>
-        <w:t>periferias. Era uma maneira de ocupar espaços públicos e expressar o que as vozes marginalizadas queriam dizer.</w:t>
+        <w:t xml:space="preserve"> utilizou dois toca-discos para repetir os “breaks” das músicas — partes instrumentais com batidas fortes que faziam </w:t>
+      </w:r>
+      <w:proofErr w:type="gramStart"/>
+      <w:r>
+        <w:t>a galera</w:t>
+      </w:r>
+      <w:proofErr w:type="gramEnd"/>
+      <w:r>
+        <w:t xml:space="preserve"> dançar com mais energia. Essa técnica foi um dos marcos iniciais do que mais tarde se tornaria a batida clássica do Hip-Hop.</w:t>
+      </w:r>
+    </w:p>
+    <w:p>
+      <w:r>
+        <w:t>A partir daí, MCs começaram a rimar sobre essas batidas, os jovens passaram a dançar nas ruas com passos únicos e o grafite se espalhou como arte visual das periferias. Era uma maneira de ocupar espaços públicos e expressar o que as vozes marginalizadas queriam dizer.</w:t>
       </w:r>
     </w:p>
     <w:p>
@@ -380,6 +436,7 @@
     </w:p>
     <w:p>
       <w:r>
+        <w:lastRenderedPageBreak/>
         <w:t>O Hip-Hop teve um papel fundamental na minha formação como pessoa. Ele me mostrou que aprender pode vir das ruas, das letras de rap, das rodas de conversa, das batalhas e dos encontros culturais. Através do Hip-Hop:</w:t>
       </w:r>
     </w:p>
@@ -422,7 +479,6 @@
         <w:spacing w:line="279" w:lineRule="auto"/>
       </w:pPr>
       <w:r>
-        <w:lastRenderedPageBreak/>
         <w:t>Desenvolvi minha identidade com orgulho da minha origem e do meu lugar no mundo.</w:t>
       </w:r>
     </w:p>
@@ -632,6 +688,7 @@
           <w:b/>
           <w:bCs/>
         </w:rPr>
+        <w:lastRenderedPageBreak/>
         <w:t>8</w:t>
       </w:r>
       <w:r>
@@ -658,7 +715,6 @@
           <w:b/>
           <w:bCs/>
         </w:rPr>
-        <w:lastRenderedPageBreak/>
         <w:t>9</w:t>
       </w:r>
       <w:r>
@@ -1342,7 +1398,6 @@
               <w:spacing w:after="160"/>
             </w:pPr>
             <w:r>
-              <w:lastRenderedPageBreak/>
               <w:t>RNF0</w:t>
             </w:r>
             <w:r>
@@ -1660,7 +1715,23 @@
               <w:t>e público-alvo</w:t>
             </w:r>
             <w:r>
-              <w:t>; Levantar requisitos; Estrutura do banco de dados; Configurar ambiente</w:t>
+              <w:t xml:space="preserve">; </w:t>
+            </w:r>
+            <w:proofErr w:type="gramStart"/>
+            <w:r>
+              <w:t>Levantar</w:t>
+            </w:r>
+            <w:proofErr w:type="gramEnd"/>
+            <w:r>
+              <w:t xml:space="preserve"> requisitos; Estrutura do banco de dados; </w:t>
+            </w:r>
+            <w:proofErr w:type="gramStart"/>
+            <w:r>
+              <w:t>Configurar</w:t>
+            </w:r>
+            <w:proofErr w:type="gramEnd"/>
+            <w:r>
+              <w:t xml:space="preserve"> ambiente</w:t>
             </w:r>
           </w:p>
         </w:tc>
@@ -1725,7 +1796,7 @@
               <w:spacing w:after="160" w:line="278" w:lineRule="auto"/>
             </w:pPr>
             <w:r>
-              <w:t>7</w:t>
+              <w:t>19</w:t>
             </w:r>
             <w:r>
               <w:t xml:space="preserve"> dias</w:t>
@@ -2054,7 +2125,6 @@
                 </w:tcPr>
                 <w:p>
                   <w:r>
-                    <w:lastRenderedPageBreak/>
                     <w:t>Integração com banco de dados (MySQL)</w:t>
                   </w:r>
                 </w:p>
@@ -2470,6 +2540,12 @@
         </w:tc>
       </w:tr>
     </w:tbl>
+    <w:p/>
+    <w:p/>
+    <w:p/>
+    <w:p/>
+    <w:p/>
+    <w:p/>
     <w:p/>
     <w:sectPr>
       <w:pgSz w:w="11906" w:h="16838"/>
@@ -4277,23 +4353,6 @@
 </file>
 
 <file path=customXml/item1.xml><?xml version="1.0" encoding="utf-8"?>
-<p:properties xmlns:p="http://schemas.microsoft.com/office/2006/metadata/properties" xmlns:xsi="http://www.w3.org/2001/XMLSchema-instance" xmlns:pc="http://schemas.microsoft.com/office/infopath/2007/PartnerControls">
-  <documentManagement>
-    <_activity xmlns="1dc861b8-2196-455d-b291-a999da8cffb6" xsi:nil="true"/>
-  </documentManagement>
-</p:properties>
-</file>
-
-<file path=customXml/item2.xml><?xml version="1.0" encoding="utf-8"?>
-<?mso-contentType ?>
-<FormTemplates xmlns="http://schemas.microsoft.com/sharepoint/v3/contenttype/forms">
-  <Display>DocumentLibraryForm</Display>
-  <Edit>DocumentLibraryForm</Edit>
-  <New>DocumentLibraryForm</New>
-</FormTemplates>
-</file>
-
-<file path=customXml/item3.xml><?xml version="1.0" encoding="utf-8"?>
 <ct:contentTypeSchema xmlns:ct="http://schemas.microsoft.com/office/2006/metadata/contentType" xmlns:ma="http://schemas.microsoft.com/office/2006/metadata/properties/metaAttributes" ct:_="" ma:_="" ma:contentTypeName="Document" ma:contentTypeID="0x01010045B33021656A9E479DF12B9A8EE42828" ma:contentTypeVersion="10" ma:contentTypeDescription="Create a new document." ma:contentTypeScope="" ma:versionID="9aeec8081f67b1ca137865794d1f151a">
   <xsd:schema xmlns:xsd="http://www.w3.org/2001/XMLSchema" xmlns:xs="http://www.w3.org/2001/XMLSchema" xmlns:p="http://schemas.microsoft.com/office/2006/metadata/properties" xmlns:ns3="1dc861b8-2196-455d-b291-a999da8cffb6" targetNamespace="http://schemas.microsoft.com/office/2006/metadata/properties" ma:root="true" ma:fieldsID="a4acce7dd61a660a864f072d5da9b186" ns3:_="">
     <xsd:import namespace="1dc861b8-2196-455d-b291-a999da8cffb6"/>
@@ -4475,25 +4534,24 @@
 </ct:contentTypeSchema>
 </file>
 
-<file path=customXml/itemProps1.xml><?xml version="1.0" encoding="utf-8"?>
-<ds:datastoreItem xmlns:ds="http://schemas.openxmlformats.org/officeDocument/2006/customXml" ds:itemID="{B95AA667-3958-4559-823B-08711B33F712}">
-  <ds:schemaRefs>
-    <ds:schemaRef ds:uri="http://schemas.microsoft.com/office/2006/metadata/properties"/>
-    <ds:schemaRef ds:uri="http://schemas.microsoft.com/office/infopath/2007/PartnerControls"/>
-    <ds:schemaRef ds:uri="1dc861b8-2196-455d-b291-a999da8cffb6"/>
-  </ds:schemaRefs>
-</ds:datastoreItem>
+<file path=customXml/item2.xml><?xml version="1.0" encoding="utf-8"?>
+<?mso-contentType ?>
+<FormTemplates xmlns="http://schemas.microsoft.com/sharepoint/v3/contenttype/forms">
+  <Display>DocumentLibraryForm</Display>
+  <Edit>DocumentLibraryForm</Edit>
+  <New>DocumentLibraryForm</New>
+</FormTemplates>
 </file>
 
-<file path=customXml/itemProps2.xml><?xml version="1.0" encoding="utf-8"?>
-<ds:datastoreItem xmlns:ds="http://schemas.openxmlformats.org/officeDocument/2006/customXml" ds:itemID="{47322840-2261-4727-97BA-1A7CDB430E24}">
-  <ds:schemaRefs>
-    <ds:schemaRef ds:uri="http://schemas.microsoft.com/sharepoint/v3/contenttype/forms"/>
-  </ds:schemaRefs>
-</ds:datastoreItem>
+<file path=customXml/item3.xml><?xml version="1.0" encoding="utf-8"?>
+<p:properties xmlns:p="http://schemas.microsoft.com/office/2006/metadata/properties" xmlns:xsi="http://www.w3.org/2001/XMLSchema-instance" xmlns:pc="http://schemas.microsoft.com/office/infopath/2007/PartnerControls">
+  <documentManagement>
+    <_activity xmlns="1dc861b8-2196-455d-b291-a999da8cffb6" xsi:nil="true"/>
+  </documentManagement>
+</p:properties>
 </file>
 
-<file path=customXml/itemProps3.xml><?xml version="1.0" encoding="utf-8"?>
+<file path=customXml/itemProps1.xml><?xml version="1.0" encoding="utf-8"?>
 <ds:datastoreItem xmlns:ds="http://schemas.openxmlformats.org/officeDocument/2006/customXml" ds:itemID="{D0A3153E-2E1E-45EC-8B9D-7A5F44DC8C54}">
   <ds:schemaRefs>
     <ds:schemaRef ds:uri="http://schemas.microsoft.com/office/2006/metadata/contentType"/>
@@ -4509,4 +4567,22 @@
     <ds:schemaRef ds:uri="http://schemas.microsoft.com/internal/obd"/>
   </ds:schemaRefs>
 </ds:datastoreItem>
+</file>
+
+<file path=customXml/itemProps2.xml><?xml version="1.0" encoding="utf-8"?>
+<ds:datastoreItem xmlns:ds="http://schemas.openxmlformats.org/officeDocument/2006/customXml" ds:itemID="{47322840-2261-4727-97BA-1A7CDB430E24}">
+  <ds:schemaRefs>
+    <ds:schemaRef ds:uri="http://schemas.microsoft.com/sharepoint/v3/contenttype/forms"/>
+  </ds:schemaRefs>
+</ds:datastoreItem>
+</file>
+
+<file path=customXml/itemProps3.xml><?xml version="1.0" encoding="utf-8"?>
+<ds:datastoreItem xmlns:ds="http://schemas.openxmlformats.org/officeDocument/2006/customXml" ds:itemID="{B95AA667-3958-4559-823B-08711B33F712}">
+  <ds:schemaRefs>
+    <ds:schemaRef ds:uri="http://schemas.microsoft.com/office/2006/metadata/properties"/>
+    <ds:schemaRef ds:uri="http://schemas.microsoft.com/office/infopath/2007/PartnerControls"/>
+    <ds:schemaRef ds:uri="1dc861b8-2196-455d-b291-a999da8cffb6"/>
+  </ds:schemaRefs>
+</ds:datastoreItem>
 </file>
</xml_diff>